<commit_message>
xp-hc-vlncn-sct-vn 1.5.0: chuan hoa the thuc theo ho so da ban hanh (bo Khi cong nghiep) + cap nhat bo HCM Tay Bac
</commit_message>
<xml_diff>
--- a/xp-hc-vlncn-sct-vn/skills/xp-hc-vlncn-sct-vn/vi-du-thuc-te/bo-ho-so-kiem-tra-HCM-TayBac/2026.08.17. Biên bản 1 - Công bố Quyết định kiểm tra - Hóa chất mỏ Tây Bắc.docx
+++ b/xp-hc-vlncn-sct-vn/skills/xp-hc-vlncn-sct-vn/vi-du-thuc-te/bo-ho-so-kiem-tra-HCM-TayBac/2026.08.17. Biên bản 1 - Công bố Quyết định kiểm tra - Hóa chất mỏ Tây Bắc.docx
@@ -248,7 +248,7 @@
                 <w:sz w:val="26"/>
                 <w:szCs w:val="26"/>
               </w:rPr>
-              <w:t xml:space="preserve"/>
+              <w:t xml:space="preserve">Số: 01/BB-ĐKT</w:t>
             </w:r>
           </w:p>
         </w:tc>
@@ -643,7 +643,7 @@
           <w:sz w:val="28"/>
           <w:b/>
         </w:rPr>
-        <w:t xml:space="preserve">1. Đoàn kiểm tra theo Quyết định số 4875/QĐ-SCT</w:t>
+        <w:t xml:space="preserve">I. THÀNH PHẦN THAM DỰ</w:t>
       </w:r>
       <w:r>
         <w:rPr>
@@ -715,6 +715,7 @@
           <w:rFonts w:ascii="Times New Roman" w:hAnsi="Times New Roman"/>
           <w:szCs w:val="32"/>
           <w:lang w:val="nl-NL"/>
+          <w:b/>
         </w:rPr>
       </w:r>
       <w:r>
@@ -723,38 +724,43 @@
           <w:szCs w:val="28"/>
           <w:lang w:val="nl-NL"/>
           <w:sz w:val="28"/>
-        </w:rPr>
-        <w:t xml:space="preserve">- Ông Trần Trọng Trang - Phó Trưởng phòng Quản lý Công nghiệp, Trưởng đoàn;</w:t>
-      </w:r>
-      <w:r>
-        <w:rPr>
-          <w:rFonts w:ascii="Times New Roman" w:hAnsi="Times New Roman" w:cs="Arial"/>
-          <w:szCs w:val="32"/>
-          <w:lang w:val="nl-NL"/>
-        </w:rPr>
-        <w:t/>
-      </w:r>
-      <w:r>
-        <w:rPr>
-          <w:rFonts w:ascii="Times New Roman" w:hAnsi="Times New Roman"/>
-          <w:szCs w:val="32"/>
-          <w:lang w:val="nl-NL"/>
-        </w:rPr>
-        <w:t/>
-      </w:r>
-      <w:r>
-        <w:rPr>
-          <w:rFonts w:ascii="Times New Roman" w:hAnsi="Times New Roman" w:cs="Arial"/>
-          <w:szCs w:val="32"/>
-          <w:lang w:val="nl-NL"/>
-        </w:rPr>
-        <w:t/>
-      </w:r>
-      <w:r>
-        <w:rPr>
-          <w:rFonts w:ascii="Times New Roman" w:hAnsi="Times New Roman"/>
-          <w:szCs w:val="32"/>
-          <w:lang w:val="nl-NL"/>
+          <w:b/>
+        </w:rPr>
+        <w:t xml:space="preserve">1. Đoàn kiểm tra theo Quyết định số 4875/QĐ-SCT ngày 12/8/2026 của Giám đốc Sở Công Thương tỉnh Lào Cai</w:t>
+      </w:r>
+      <w:r>
+        <w:rPr>
+          <w:rFonts w:ascii="Times New Roman" w:hAnsi="Times New Roman" w:cs="Arial"/>
+          <w:szCs w:val="32"/>
+          <w:lang w:val="nl-NL"/>
+          <w:b/>
+        </w:rPr>
+        <w:t/>
+      </w:r>
+      <w:r>
+        <w:rPr>
+          <w:rFonts w:ascii="Times New Roman" w:hAnsi="Times New Roman"/>
+          <w:szCs w:val="32"/>
+          <w:lang w:val="nl-NL"/>
+          <w:b/>
+        </w:rPr>
+        <w:t/>
+      </w:r>
+      <w:r>
+        <w:rPr>
+          <w:rFonts w:ascii="Times New Roman" w:hAnsi="Times New Roman" w:cs="Arial"/>
+          <w:szCs w:val="32"/>
+          <w:lang w:val="nl-NL"/>
+          <w:b/>
+        </w:rPr>
+        <w:t/>
+      </w:r>
+      <w:r>
+        <w:rPr>
+          <w:rFonts w:ascii="Times New Roman" w:hAnsi="Times New Roman"/>
+          <w:szCs w:val="32"/>
+          <w:lang w:val="nl-NL"/>
+          <w:b/>
         </w:rPr>
         <w:t xml:space="preserve"/>
       </w:r>
@@ -763,13 +769,15 @@
           <w:rFonts w:ascii="Times New Roman" w:hAnsi="Times New Roman"/>
           <w:color w:val="000000" w:themeColor="text1"/>
           <w:szCs w:val="28"/>
-        </w:rPr>
-        <w:t xml:space="preserve"/>
-      </w:r>
-      <w:r>
-        <w:rPr>
-          <w:rFonts w:ascii="Times New Roman" w:hAnsi="Times New Roman"/>
-          <w:szCs w:val="28"/>
+          <w:b/>
+        </w:rPr>
+        <w:t xml:space="preserve"/>
+      </w:r>
+      <w:r>
+        <w:rPr>
+          <w:rFonts w:ascii="Times New Roman" w:hAnsi="Times New Roman"/>
+          <w:szCs w:val="28"/>
+          <w:b/>
         </w:rPr>
         <w:t xml:space="preserve"/>
       </w:r>
@@ -799,7 +807,7 @@
           <w:lang w:val="nl-NL"/>
           <w:sz w:val="28"/>
         </w:rPr>
-        <w:t xml:space="preserve">- Ông Lê Minh Long - Chuyên viên phòng Quản lý Công nghiệp, Thành viên;</w:t>
+        <w:t xml:space="preserve">- Ông Trần Trọng Trang - Phó Trưởng phòng Quản lý Công nghiệp, Trưởng đoàn;</w:t>
       </w:r>
       <w:r>
         <w:rPr>
@@ -874,7 +882,7 @@
           <w:lang w:val="nl-NL"/>
           <w:sz w:val="28"/>
         </w:rPr>
-        <w:t xml:space="preserve">- Ông Trần Đăng Khôi - Chuyên viên phòng Quản lý Công nghiệp, Thành viên - Thư ký đoàn.</w:t>
+        <w:t xml:space="preserve">- Ông Lê Minh Long - Chuyên viên phòng Quản lý Công nghiệp, Thành viên;</w:t>
       </w:r>
       <w:r>
         <w:rPr>
@@ -940,7 +948,6 @@
           <w:rFonts w:ascii="Times New Roman" w:hAnsi="Times New Roman"/>
           <w:szCs w:val="32"/>
           <w:lang w:val="nl-NL"/>
-          <w:b/>
         </w:rPr>
       </w:r>
       <w:r>
@@ -949,43 +956,38 @@
           <w:szCs w:val="28"/>
           <w:lang w:val="nl-NL"/>
           <w:sz w:val="28"/>
-          <w:b/>
-        </w:rPr>
-        <w:t xml:space="preserve">2. Đại diện Công ty Công nghiệp Hóa chất mỏ Tây Bắc</w:t>
-      </w:r>
-      <w:r>
-        <w:rPr>
-          <w:rFonts w:ascii="Times New Roman" w:hAnsi="Times New Roman" w:cs="Arial"/>
-          <w:szCs w:val="32"/>
-          <w:lang w:val="nl-NL"/>
-          <w:b/>
-        </w:rPr>
-        <w:t/>
-      </w:r>
-      <w:r>
-        <w:rPr>
-          <w:rFonts w:ascii="Times New Roman" w:hAnsi="Times New Roman"/>
-          <w:szCs w:val="32"/>
-          <w:lang w:val="nl-NL"/>
-          <w:b/>
-        </w:rPr>
-        <w:t/>
-      </w:r>
-      <w:r>
-        <w:rPr>
-          <w:rFonts w:ascii="Times New Roman" w:hAnsi="Times New Roman" w:cs="Arial"/>
-          <w:szCs w:val="32"/>
-          <w:lang w:val="nl-NL"/>
-          <w:b/>
-        </w:rPr>
-        <w:t/>
-      </w:r>
-      <w:r>
-        <w:rPr>
-          <w:rFonts w:ascii="Times New Roman" w:hAnsi="Times New Roman"/>
-          <w:szCs w:val="32"/>
-          <w:lang w:val="nl-NL"/>
-          <w:b/>
+        </w:rPr>
+        <w:t xml:space="preserve">- Ông Trần Đăng Khôi - Chuyên viên phòng Quản lý Công nghiệp, Thành viên - Thư ký đoàn.</w:t>
+      </w:r>
+      <w:r>
+        <w:rPr>
+          <w:rFonts w:ascii="Times New Roman" w:hAnsi="Times New Roman" w:cs="Arial"/>
+          <w:szCs w:val="32"/>
+          <w:lang w:val="nl-NL"/>
+        </w:rPr>
+        <w:t/>
+      </w:r>
+      <w:r>
+        <w:rPr>
+          <w:rFonts w:ascii="Times New Roman" w:hAnsi="Times New Roman"/>
+          <w:szCs w:val="32"/>
+          <w:lang w:val="nl-NL"/>
+        </w:rPr>
+        <w:t/>
+      </w:r>
+      <w:r>
+        <w:rPr>
+          <w:rFonts w:ascii="Times New Roman" w:hAnsi="Times New Roman" w:cs="Arial"/>
+          <w:szCs w:val="32"/>
+          <w:lang w:val="nl-NL"/>
+        </w:rPr>
+        <w:t/>
+      </w:r>
+      <w:r>
+        <w:rPr>
+          <w:rFonts w:ascii="Times New Roman" w:hAnsi="Times New Roman"/>
+          <w:szCs w:val="32"/>
+          <w:lang w:val="nl-NL"/>
         </w:rPr>
         <w:t xml:space="preserve"/>
       </w:r>
@@ -994,15 +996,13 @@
           <w:rFonts w:ascii="Times New Roman" w:hAnsi="Times New Roman"/>
           <w:color w:val="000000" w:themeColor="text1"/>
           <w:szCs w:val="28"/>
-          <w:b/>
-        </w:rPr>
-        <w:t xml:space="preserve"/>
-      </w:r>
-      <w:r>
-        <w:rPr>
-          <w:rFonts w:ascii="Times New Roman" w:hAnsi="Times New Roman"/>
-          <w:szCs w:val="28"/>
-          <w:b/>
+        </w:rPr>
+        <w:t xml:space="preserve"/>
+      </w:r>
+      <w:r>
+        <w:rPr>
+          <w:rFonts w:ascii="Times New Roman" w:hAnsi="Times New Roman"/>
+          <w:szCs w:val="28"/>
         </w:rPr>
         <w:t xml:space="preserve"/>
       </w:r>
@@ -1010,7 +1010,7 @@
     <w:p>
       <w:pPr>
         <w:spacing w:after="40" w:line="340" w:lineRule="exact"/>
-        <w:jc w:val="left"/>
+        <w:jc w:val="both"/>
         <w:rPr>
           <w:rFonts w:ascii="Times New Roman" w:hAnsi="Times New Roman"/>
           <w:i/>
@@ -1023,6 +1023,7 @@
           <w:rFonts w:ascii="Times New Roman" w:hAnsi="Times New Roman"/>
           <w:szCs w:val="32"/>
           <w:lang w:val="nl-NL"/>
+          <w:b/>
         </w:rPr>
       </w:r>
       <w:r>
@@ -1031,38 +1032,43 @@
           <w:szCs w:val="28"/>
           <w:lang w:val="nl-NL"/>
           <w:sz w:val="28"/>
-        </w:rPr>
-        <w:t xml:space="preserve">- Ông (bà): ..................................... Chức vụ: .....................................;</w:t>
-      </w:r>
-      <w:r>
-        <w:rPr>
-          <w:rFonts w:ascii="Times New Roman" w:hAnsi="Times New Roman" w:cs="Arial"/>
-          <w:szCs w:val="32"/>
-          <w:lang w:val="nl-NL"/>
-        </w:rPr>
-        <w:t/>
-      </w:r>
-      <w:r>
-        <w:rPr>
-          <w:rFonts w:ascii="Times New Roman" w:hAnsi="Times New Roman"/>
-          <w:szCs w:val="32"/>
-          <w:lang w:val="nl-NL"/>
-        </w:rPr>
-        <w:t/>
-      </w:r>
-      <w:r>
-        <w:rPr>
-          <w:rFonts w:ascii="Times New Roman" w:hAnsi="Times New Roman" w:cs="Arial"/>
-          <w:szCs w:val="32"/>
-          <w:lang w:val="nl-NL"/>
-        </w:rPr>
-        <w:t/>
-      </w:r>
-      <w:r>
-        <w:rPr>
-          <w:rFonts w:ascii="Times New Roman" w:hAnsi="Times New Roman"/>
-          <w:szCs w:val="32"/>
-          <w:lang w:val="nl-NL"/>
+          <w:b/>
+        </w:rPr>
+        <w:t xml:space="preserve">2. Đại diện Công ty Công nghiệp Hóa chất mỏ Tây Bắc</w:t>
+      </w:r>
+      <w:r>
+        <w:rPr>
+          <w:rFonts w:ascii="Times New Roman" w:hAnsi="Times New Roman" w:cs="Arial"/>
+          <w:szCs w:val="32"/>
+          <w:lang w:val="nl-NL"/>
+          <w:b/>
+        </w:rPr>
+        <w:t/>
+      </w:r>
+      <w:r>
+        <w:rPr>
+          <w:rFonts w:ascii="Times New Roman" w:hAnsi="Times New Roman"/>
+          <w:szCs w:val="32"/>
+          <w:lang w:val="nl-NL"/>
+          <w:b/>
+        </w:rPr>
+        <w:t/>
+      </w:r>
+      <w:r>
+        <w:rPr>
+          <w:rFonts w:ascii="Times New Roman" w:hAnsi="Times New Roman" w:cs="Arial"/>
+          <w:szCs w:val="32"/>
+          <w:lang w:val="nl-NL"/>
+          <w:b/>
+        </w:rPr>
+        <w:t/>
+      </w:r>
+      <w:r>
+        <w:rPr>
+          <w:rFonts w:ascii="Times New Roman" w:hAnsi="Times New Roman"/>
+          <w:szCs w:val="32"/>
+          <w:lang w:val="nl-NL"/>
+          <w:b/>
         </w:rPr>
         <w:t xml:space="preserve"/>
       </w:r>
@@ -1071,13 +1077,15 @@
           <w:rFonts w:ascii="Times New Roman" w:hAnsi="Times New Roman"/>
           <w:color w:val="000000" w:themeColor="text1"/>
           <w:szCs w:val="28"/>
-        </w:rPr>
-        <w:t xml:space="preserve"/>
-      </w:r>
-      <w:r>
-        <w:rPr>
-          <w:rFonts w:ascii="Times New Roman" w:hAnsi="Times New Roman"/>
-          <w:szCs w:val="28"/>
+          <w:b/>
+        </w:rPr>
+        <w:t xml:space="preserve"/>
+      </w:r>
+      <w:r>
+        <w:rPr>
+          <w:rFonts w:ascii="Times New Roman" w:hAnsi="Times New Roman"/>
+          <w:szCs w:val="28"/>
+          <w:b/>
         </w:rPr>
         <w:t xml:space="preserve"/>
       </w:r>
@@ -1107,7 +1115,7 @@
           <w:lang w:val="nl-NL"/>
           <w:sz w:val="28"/>
         </w:rPr>
-        <w:t xml:space="preserve">- Ông (bà): ..................................... Chức vụ: .....................................</w:t>
+        <w:t xml:space="preserve">- Ông (bà): ..................................... Chức vụ: .....................................;</w:t>
       </w:r>
       <w:r>
         <w:rPr>
@@ -1160,7 +1168,7 @@
     <w:p>
       <w:pPr>
         <w:spacing w:after="40" w:line="340" w:lineRule="exact"/>
-        <w:jc w:val="both"/>
+        <w:jc w:val="left"/>
         <w:rPr>
           <w:rFonts w:ascii="Times New Roman" w:hAnsi="Times New Roman"/>
           <w:i/>
@@ -1173,7 +1181,6 @@
           <w:rFonts w:ascii="Times New Roman" w:hAnsi="Times New Roman"/>
           <w:szCs w:val="32"/>
           <w:lang w:val="nl-NL"/>
-          <w:b/>
         </w:rPr>
       </w:r>
       <w:r>
@@ -1182,43 +1189,38 @@
           <w:szCs w:val="28"/>
           <w:lang w:val="nl-NL"/>
           <w:sz w:val="28"/>
-          <w:b/>
-        </w:rPr>
-        <w:t xml:space="preserve">3. Nội dung công bố</w:t>
-      </w:r>
-      <w:r>
-        <w:rPr>
-          <w:rFonts w:ascii="Times New Roman" w:hAnsi="Times New Roman" w:cs="Arial"/>
-          <w:szCs w:val="32"/>
-          <w:lang w:val="nl-NL"/>
-          <w:b/>
-        </w:rPr>
-        <w:t/>
-      </w:r>
-      <w:r>
-        <w:rPr>
-          <w:rFonts w:ascii="Times New Roman" w:hAnsi="Times New Roman"/>
-          <w:szCs w:val="32"/>
-          <w:lang w:val="nl-NL"/>
-          <w:b/>
-        </w:rPr>
-        <w:t/>
-      </w:r>
-      <w:r>
-        <w:rPr>
-          <w:rFonts w:ascii="Times New Roman" w:hAnsi="Times New Roman" w:cs="Arial"/>
-          <w:szCs w:val="32"/>
-          <w:lang w:val="nl-NL"/>
-          <w:b/>
-        </w:rPr>
-        <w:t/>
-      </w:r>
-      <w:r>
-        <w:rPr>
-          <w:rFonts w:ascii="Times New Roman" w:hAnsi="Times New Roman"/>
-          <w:szCs w:val="32"/>
-          <w:lang w:val="nl-NL"/>
-          <w:b/>
+        </w:rPr>
+        <w:t xml:space="preserve">- Ông (bà): ..................................... Chức vụ: .....................................</w:t>
+      </w:r>
+      <w:r>
+        <w:rPr>
+          <w:rFonts w:ascii="Times New Roman" w:hAnsi="Times New Roman" w:cs="Arial"/>
+          <w:szCs w:val="32"/>
+          <w:lang w:val="nl-NL"/>
+        </w:rPr>
+        <w:t/>
+      </w:r>
+      <w:r>
+        <w:rPr>
+          <w:rFonts w:ascii="Times New Roman" w:hAnsi="Times New Roman"/>
+          <w:szCs w:val="32"/>
+          <w:lang w:val="nl-NL"/>
+        </w:rPr>
+        <w:t/>
+      </w:r>
+      <w:r>
+        <w:rPr>
+          <w:rFonts w:ascii="Times New Roman" w:hAnsi="Times New Roman" w:cs="Arial"/>
+          <w:szCs w:val="32"/>
+          <w:lang w:val="nl-NL"/>
+        </w:rPr>
+        <w:t/>
+      </w:r>
+      <w:r>
+        <w:rPr>
+          <w:rFonts w:ascii="Times New Roman" w:hAnsi="Times New Roman"/>
+          <w:szCs w:val="32"/>
+          <w:lang w:val="nl-NL"/>
         </w:rPr>
         <w:t xml:space="preserve"/>
       </w:r>
@@ -1227,15 +1229,13 @@
           <w:rFonts w:ascii="Times New Roman" w:hAnsi="Times New Roman"/>
           <w:color w:val="000000" w:themeColor="text1"/>
           <w:szCs w:val="28"/>
-          <w:b/>
-        </w:rPr>
-        <w:t xml:space="preserve"/>
-      </w:r>
-      <w:r>
-        <w:rPr>
-          <w:rFonts w:ascii="Times New Roman" w:hAnsi="Times New Roman"/>
-          <w:szCs w:val="28"/>
-          <w:b/>
+        </w:rPr>
+        <w:t xml:space="preserve"/>
+      </w:r>
+      <w:r>
+        <w:rPr>
+          <w:rFonts w:ascii="Times New Roman" w:hAnsi="Times New Roman"/>
+          <w:szCs w:val="28"/>
         </w:rPr>
         <w:t xml:space="preserve"/>
       </w:r>
@@ -1256,6 +1256,7 @@
           <w:rFonts w:ascii="Times New Roman" w:hAnsi="Times New Roman"/>
           <w:szCs w:val="32"/>
           <w:lang w:val="nl-NL"/>
+          <w:b/>
         </w:rPr>
       </w:r>
       <w:r>
@@ -1264,38 +1265,43 @@
           <w:szCs w:val="28"/>
           <w:lang w:val="nl-NL"/>
           <w:sz w:val="28"/>
-        </w:rPr>
-        <w:t xml:space="preserve">3.1. Trưởng đoàn kiểm tra công bố toàn văn Quyết định số 4875/QĐ-SCT ngày 12/8/2026 của Giám đốc Sở Công Thương tỉnh Lào Cai về việc thành lập Đoàn kiểm tra, xác minh việc lập, thực hiện các hộ chiếu nổ mìn của Công ty Công nghiệp Hóa chất mỏ Tây Bắc nêu tại Kết luận thanh tra số 48/KL-TT ngày 05/7/2026 của Chánh Thanh tra tỉnh.</w:t>
-      </w:r>
-      <w:r>
-        <w:rPr>
-          <w:rFonts w:ascii="Times New Roman" w:hAnsi="Times New Roman" w:cs="Arial"/>
-          <w:szCs w:val="32"/>
-          <w:lang w:val="nl-NL"/>
-        </w:rPr>
-        <w:t/>
-      </w:r>
-      <w:r>
-        <w:rPr>
-          <w:rFonts w:ascii="Times New Roman" w:hAnsi="Times New Roman"/>
-          <w:szCs w:val="32"/>
-          <w:lang w:val="nl-NL"/>
-        </w:rPr>
-        <w:t/>
-      </w:r>
-      <w:r>
-        <w:rPr>
-          <w:rFonts w:ascii="Times New Roman" w:hAnsi="Times New Roman" w:cs="Arial"/>
-          <w:szCs w:val="32"/>
-          <w:lang w:val="nl-NL"/>
-        </w:rPr>
-        <w:t/>
-      </w:r>
-      <w:r>
-        <w:rPr>
-          <w:rFonts w:ascii="Times New Roman" w:hAnsi="Times New Roman"/>
-          <w:szCs w:val="32"/>
-          <w:lang w:val="nl-NL"/>
+          <w:b/>
+        </w:rPr>
+        <w:t xml:space="preserve">II. NỘI DUNG</w:t>
+      </w:r>
+      <w:r>
+        <w:rPr>
+          <w:rFonts w:ascii="Times New Roman" w:hAnsi="Times New Roman" w:cs="Arial"/>
+          <w:szCs w:val="32"/>
+          <w:lang w:val="nl-NL"/>
+          <w:b/>
+        </w:rPr>
+        <w:t/>
+      </w:r>
+      <w:r>
+        <w:rPr>
+          <w:rFonts w:ascii="Times New Roman" w:hAnsi="Times New Roman"/>
+          <w:szCs w:val="32"/>
+          <w:lang w:val="nl-NL"/>
+          <w:b/>
+        </w:rPr>
+        <w:t/>
+      </w:r>
+      <w:r>
+        <w:rPr>
+          <w:rFonts w:ascii="Times New Roman" w:hAnsi="Times New Roman" w:cs="Arial"/>
+          <w:szCs w:val="32"/>
+          <w:lang w:val="nl-NL"/>
+          <w:b/>
+        </w:rPr>
+        <w:t/>
+      </w:r>
+      <w:r>
+        <w:rPr>
+          <w:rFonts w:ascii="Times New Roman" w:hAnsi="Times New Roman"/>
+          <w:szCs w:val="32"/>
+          <w:lang w:val="nl-NL"/>
+          <w:b/>
         </w:rPr>
         <w:t xml:space="preserve"/>
       </w:r>
@@ -1304,13 +1310,15 @@
           <w:rFonts w:ascii="Times New Roman" w:hAnsi="Times New Roman"/>
           <w:color w:val="000000" w:themeColor="text1"/>
           <w:szCs w:val="28"/>
-        </w:rPr>
-        <w:t xml:space="preserve"/>
-      </w:r>
-      <w:r>
-        <w:rPr>
-          <w:rFonts w:ascii="Times New Roman" w:hAnsi="Times New Roman"/>
-          <w:szCs w:val="28"/>
+          <w:b/>
+        </w:rPr>
+        <w:t xml:space="preserve"/>
+      </w:r>
+      <w:r>
+        <w:rPr>
+          <w:rFonts w:ascii="Times New Roman" w:hAnsi="Times New Roman"/>
+          <w:szCs w:val="28"/>
+          <w:b/>
         </w:rPr>
         <w:t xml:space="preserve"/>
       </w:r>
@@ -1340,7 +1348,7 @@
           <w:lang w:val="nl-NL"/>
           <w:sz w:val="28"/>
         </w:rPr>
-        <w:t xml:space="preserve">3.2. Đoàn kiểm tra nêu rõ đối tượng, phạm vi, nội dung, thời hạn kiểm tra theo Điều 2 Quyết định số 4875/QĐ-SCT; phạm vi kiểm tra giới hạn ở 03 hộ chiếu nổ mìn nêu tại Mục 3.3 Phần II Kết luận thanh tra số 48/KL-TT ngày 05/7/2026 của Chánh Thanh tra tỉnh, gồm:</w:t>
+        <w:t xml:space="preserve">1. Trưởng đoàn kiểm tra công bố toàn văn Quyết định số 4875/QĐ-SCT ngày 12/8/2026 của Giám đốc Sở Công Thương tỉnh Lào Cai về việc thành lập Đoàn kiểm tra, xác minh việc lập, thực hiện các hộ chiếu nổ mìn của Công ty Công nghiệp Hóa chất mỏ Tây Bắc nêu tại Kết luận thanh tra số 48/KL-TT ngày 05/7/2026 của Chánh Thanh tra tỉnh.</w:t>
       </w:r>
       <w:r>
         <w:rPr>
@@ -1415,7 +1423,7 @@
           <w:lang w:val="nl-NL"/>
           <w:sz w:val="28"/>
         </w:rPr>
-        <w:t xml:space="preserve">- Hộ chiếu nổ mìn số 14/2022HCNM ngày 13/6/2022, khai trường Ngòi Đum - Đông Hồ;</w:t>
+        <w:t xml:space="preserve">2. Đoàn kiểm tra nêu rõ đối tượng, phạm vi, nội dung, thời hạn kiểm tra theo Điều 2 Quyết định số 4875/QĐ-SCT; phạm vi kiểm tra giới hạn ở 03 hộ chiếu nổ mìn nêu tại Mục 3.3 Phần II Kết luận thanh tra số 48/KL-TT ngày 05/7/2026 của Chánh Thanh tra tỉnh, gồm:</w:t>
       </w:r>
       <w:r>
         <w:rPr>
@@ -1490,7 +1498,7 @@
           <w:lang w:val="nl-NL"/>
           <w:sz w:val="28"/>
         </w:rPr>
-        <w:t xml:space="preserve">- Hộ chiếu nổ mìn số 12/HCNM ngày 29/01/2024, khai trường Mỏ Cóc 1;</w:t>
+        <w:t xml:space="preserve">- Hộ chiếu nổ mìn số 14/2022HCNM ngày 13/6/2022, khai trường Ngòi Đum - Đông Hồ;</w:t>
       </w:r>
       <w:r>
         <w:rPr>
@@ -1565,7 +1573,7 @@
           <w:lang w:val="nl-NL"/>
           <w:sz w:val="28"/>
         </w:rPr>
-        <w:t xml:space="preserve">- Hộ chiếu nổ mìn số 05/02/2025/HCNM ngày 03/02/2025, khai trường Mỏ Cóc 1;</w:t>
+        <w:t xml:space="preserve">- Hộ chiếu nổ mìn số 12/HCNM ngày 29/01/2024, khai trường Mỏ Cóc 1;</w:t>
       </w:r>
       <w:r>
         <w:rPr>
@@ -1640,7 +1648,7 @@
           <w:lang w:val="nl-NL"/>
           <w:sz w:val="28"/>
         </w:rPr>
-        <w:t xml:space="preserve">Đoàn kiểm tra không kiểm tra lại các nội dung đã được thanh tra, kết luận; không mở rộng phạm vi ngoài 03 hộ chiếu nổ mìn nêu trên.</w:t>
+        <w:t xml:space="preserve">- Hộ chiếu nổ mìn số 05/02/2025/HCNM ngày 03/02/2025, khai trường Mỏ Cóc 1;</w:t>
       </w:r>
       <w:r>
         <w:rPr>
@@ -1715,7 +1723,7 @@
           <w:lang w:val="nl-NL"/>
           <w:sz w:val="28"/>
         </w:rPr>
-        <w:t xml:space="preserve">3.3. Đoàn kiểm tra thông báo Kế hoạch tiến hành kiểm tra đã được phê duyệt; quyền và nghĩa vụ của đối tượng kiểm tra theo Điều 15 Nghị định số 217/2025/NĐ-CP ngày 05/8/2025 của Chính phủ; đề nghị Công ty cung cấp hồ sơ, tài liệu và cử người có thẩm quyền làm việc với Đoàn kiểm tra.</w:t>
+        <w:t xml:space="preserve">Đoàn kiểm tra không kiểm tra lại các nội dung đã được thanh tra, kết luận; không mở rộng phạm vi ngoài 03 hộ chiếu nổ mìn nêu trên.</w:t>
       </w:r>
       <w:r>
         <w:rPr>
@@ -1781,7 +1789,6 @@
           <w:rFonts w:ascii="Times New Roman" w:hAnsi="Times New Roman"/>
           <w:szCs w:val="32"/>
           <w:lang w:val="nl-NL"/>
-          <w:b/>
         </w:rPr>
       </w:r>
       <w:r>
@@ -1790,9 +1797,85 @@
           <w:szCs w:val="28"/>
           <w:lang w:val="nl-NL"/>
           <w:sz w:val="28"/>
-          <w:b/>
-        </w:rPr>
-        <w:t xml:space="preserve">4. Ý kiến của đại diện Công ty Công nghiệp Hóa chất mỏ Tây Bắc</w:t>
+        </w:rPr>
+        <w:t xml:space="preserve">3. Đoàn kiểm tra thông báo Kế hoạch tiến hành kiểm tra đã được phê duyệt; quyền và nghĩa vụ của đối tượng kiểm tra theo Điều 15 Nghị định số 217/2025/NĐ-CP ngày 05/8/2025 của Chính phủ; đề nghị Công ty cung cấp hồ sơ, tài liệu và cử người có thẩm quyền làm việc với Đoàn kiểm tra.</w:t>
+      </w:r>
+      <w:r>
+        <w:rPr>
+          <w:rFonts w:ascii="Times New Roman" w:hAnsi="Times New Roman" w:cs="Arial"/>
+          <w:szCs w:val="32"/>
+          <w:lang w:val="nl-NL"/>
+        </w:rPr>
+        <w:t/>
+      </w:r>
+      <w:r>
+        <w:rPr>
+          <w:rFonts w:ascii="Times New Roman" w:hAnsi="Times New Roman"/>
+          <w:szCs w:val="32"/>
+          <w:lang w:val="nl-NL"/>
+        </w:rPr>
+        <w:t/>
+      </w:r>
+      <w:r>
+        <w:rPr>
+          <w:rFonts w:ascii="Times New Roman" w:hAnsi="Times New Roman" w:cs="Arial"/>
+          <w:szCs w:val="32"/>
+          <w:lang w:val="nl-NL"/>
+        </w:rPr>
+        <w:t/>
+      </w:r>
+      <w:r>
+        <w:rPr>
+          <w:rFonts w:ascii="Times New Roman" w:hAnsi="Times New Roman"/>
+          <w:szCs w:val="32"/>
+          <w:lang w:val="nl-NL"/>
+        </w:rPr>
+        <w:t xml:space="preserve"/>
+      </w:r>
+      <w:r>
+        <w:rPr>
+          <w:rFonts w:ascii="Times New Roman" w:hAnsi="Times New Roman"/>
+          <w:color w:val="000000" w:themeColor="text1"/>
+          <w:szCs w:val="28"/>
+        </w:rPr>
+        <w:t xml:space="preserve"/>
+      </w:r>
+      <w:r>
+        <w:rPr>
+          <w:rFonts w:ascii="Times New Roman" w:hAnsi="Times New Roman"/>
+          <w:szCs w:val="28"/>
+        </w:rPr>
+        <w:t xml:space="preserve"/>
+      </w:r>
+    </w:p>
+    <w:p>
+      <w:pPr>
+        <w:spacing w:after="40" w:line="340" w:lineRule="exact"/>
+        <w:jc w:val="both"/>
+        <w:rPr>
+          <w:rFonts w:ascii="Times New Roman" w:hAnsi="Times New Roman"/>
+          <w:i/>
+          <w:szCs w:val="28"/>
+        </w:rPr>
+        <w:ind w:firstLine="567"/>
+      </w:pPr>
+      <w:r>
+        <w:rPr>
+          <w:rFonts w:ascii="Times New Roman" w:hAnsi="Times New Roman"/>
+          <w:szCs w:val="32"/>
+          <w:lang w:val="nl-NL"/>
+          <w:b/>
+        </w:rPr>
+      </w:r>
+      <w:r>
+        <w:rPr>
+          <w:rFonts w:ascii="Times New Roman" w:hAnsi="Times New Roman"/>
+          <w:szCs w:val="28"/>
+          <w:lang w:val="nl-NL"/>
+          <w:sz w:val="28"/>
+          <w:b/>
+        </w:rPr>
+        <w:t xml:space="preserve">III. Ý KIẾN CỦA ĐẠI DIỆN CÔNG TY CÔNG NGHIỆP HÓA CHẤT MỎ TÂY BẮC</w:t>
       </w:r>
       <w:r>
         <w:rPr>
@@ -2108,7 +2191,7 @@
                 <w:b/>
                 <w:sz w:val="26"/>
               </w:rPr>
-              <w:t xml:space="preserve">ĐẠI DIỆN CÔNG TY CÔNG NGHIỆP</w:t>
+              <w:t xml:space="preserve">CÔNG TY CÔNG NGHIỆP</w:t>
             </w:r>
           </w:p>
           <w:p>
@@ -2133,10 +2216,10 @@
             <w:r>
               <w:rPr>
                 <w:rFonts w:ascii="Times New Roman" w:hAnsi="Times New Roman"/>
+                <w:b/>
                 <w:sz w:val="26"/>
-                <w:i/>
               </w:rPr>
-              <w:t xml:space="preserve">(Ký, ghi rõ họ và tên)</w:t>
+              <w:t xml:space="preserve">GIÁM ĐỐC</w:t>
             </w:r>
           </w:p>
           <w:p>
@@ -2220,7 +2303,7 @@
                 <w:sz w:val="26"/>
                 <w:spacing w:val="-10"/>
               </w:rPr>
-              <w:t xml:space="preserve">ĐẠI DIỆN ĐOÀN KIỂM TRA</w:t>
+              <w:t xml:space="preserve">TM. ĐOÀN KIỂM TRA</w:t>
             </w:r>
           </w:p>
           <w:p>
@@ -2231,11 +2314,11 @@
             <w:r>
               <w:rPr>
                 <w:rFonts w:ascii="Times New Roman" w:hAnsi="Times New Roman"/>
+                <w:b/>
                 <w:sz w:val="26"/>
                 <w:spacing w:val="-10"/>
-                <w:i/>
               </w:rPr>
-              <w:t xml:space="preserve">(Ký, ghi rõ họ và tên)</w:t>
+              <w:t xml:space="preserve">TRƯỞNG ĐOÀN</w:t>
             </w:r>
           </w:p>
           <w:p>

</xml_diff>